<commit_message>
vault backup: 2026-07-06 23:09:24
</commit_message>
<xml_diff>
--- a/2026-6/TAML期刊审稿/TAML-D-26-00165_review.docx
+++ b/2026-6/TAML期刊审稿/TAML-D-26-00165_review.docx
@@ -4,6 +4,7 @@
   <w:body>
     <w:p>
       <w:pPr>
+        <w:jc w:val="both"/>
         <w:rPr>
           <w:rFonts w:ascii="Times New Roman" w:hAnsi="Times New Roman"/>
         </w:rPr>
@@ -42,26 +43,24 @@
         </w:rPr>
         <w:t xml:space="preserve"> application in confined granular systems.</w:t>
       </w:r>
-    </w:p>
-    <w:p>
-      <w:pPr>
-        <w:rPr>
-          <w:rFonts w:ascii="Times New Roman" w:hAnsi="Times New Roman"/>
-        </w:rPr>
-      </w:pPr>
-      <w:r>
-        <w:rPr>
-          <w:rFonts w:ascii="Times New Roman" w:hAnsi="Times New Roman"/>
-        </w:rPr>
-        <w:t>However, the manuscript currently has several notable issues: the core novelty is not sufficiently highlighted against conventional granular reinforcement; some mechanistic explanations remain at the qualitative level and lack in-depth discussion; key experimental details are missing for reproducibility; there are grammatical errors, non-standard terminology and formatting inconsistencies.</w:t>
-      </w:r>
-    </w:p>
-    <w:p>
-      <w:pPr>
-        <w:rPr>
-          <w:rFonts w:ascii="Times New Roman" w:hAnsi="Times New Roman"/>
-        </w:rPr>
-      </w:pPr>
+      <w:r>
+        <w:rPr>
+          <w:rFonts w:ascii="Times New Roman" w:hAnsi="Times New Roman" w:hint="eastAsia"/>
+        </w:rPr>
+        <w:t xml:space="preserve"> </w:t>
+      </w:r>
+      <w:r>
+        <w:rPr>
+          <w:rFonts w:ascii="Times New Roman" w:hAnsi="Times New Roman"/>
+        </w:rPr>
+        <w:t>However, the manuscript currently has several notable issues. Its core novelty is not sufficiently highlighted relative to conventional granular reinforcement. Some mechanistic explanations remain qualitative and lack in-depth discussion. Missing key experimental details undermines reproducibility. The manuscript also contains grammatical errors, non-standard terminology and formatting inconsistencies.</w:t>
+      </w:r>
+      <w:r>
+        <w:rPr>
+          <w:rFonts w:ascii="Times New Roman" w:hAnsi="Times New Roman" w:hint="eastAsia"/>
+        </w:rPr>
+        <w:t xml:space="preserve"> </w:t>
+      </w:r>
       <w:r>
         <w:rPr>
           <w:rFonts w:ascii="Times New Roman" w:hAnsi="Times New Roman"/>
@@ -70,17 +69,39 @@
       </w:r>
       <w:r>
         <w:rPr>
-          <w:rFonts w:ascii="Times New Roman" w:hAnsi="Times New Roman"/>
-          <w:b/>
-          <w:bCs/>
-        </w:rPr>
-        <w:t>Major Revision</w:t>
-      </w:r>
-      <w:r>
-        <w:rPr>
-          <w:rFonts w:ascii="Times New Roman" w:hAnsi="Times New Roman"/>
-        </w:rPr>
-        <w:t xml:space="preserve"> focused on clarifying the experimental parameters, and addressing the specific points detailed below.</w:t>
+          <w:rFonts w:ascii="Times New Roman" w:hAnsi="Times New Roman" w:hint="eastAsia"/>
+        </w:rPr>
+        <w:t>m</w:t>
+      </w:r>
+      <w:r>
+        <w:rPr>
+          <w:rFonts w:ascii="Times New Roman" w:hAnsi="Times New Roman"/>
+        </w:rPr>
+        <w:t xml:space="preserve">ajor </w:t>
+      </w:r>
+      <w:r>
+        <w:rPr>
+          <w:rFonts w:ascii="Times New Roman" w:hAnsi="Times New Roman" w:hint="eastAsia"/>
+        </w:rPr>
+        <w:t>r</w:t>
+      </w:r>
+      <w:r>
+        <w:rPr>
+          <w:rFonts w:ascii="Times New Roman" w:hAnsi="Times New Roman"/>
+        </w:rPr>
+        <w:t>evision</w:t>
+      </w:r>
+      <w:r>
+        <w:rPr>
+          <w:rFonts w:ascii="Times New Roman" w:hAnsi="Times New Roman"/>
+        </w:rPr>
+        <w:t xml:space="preserve"> </w:t>
+      </w:r>
+      <w:r>
+        <w:rPr>
+          <w:rFonts w:ascii="Times New Roman" w:hAnsi="Times New Roman"/>
+        </w:rPr>
+        <w:t>based on the following constructive points.</w:t>
       </w:r>
     </w:p>
     <w:p>
@@ -380,19 +401,11 @@
         </w:rPr>
         <w:t xml:space="preserve">. </w:t>
       </w:r>
-      <w:proofErr w:type="gramStart"/>
-      <w:r>
-        <w:rPr>
-          <w:rFonts w:ascii="Times New Roman" w:hAnsi="Times New Roman"/>
-        </w:rPr>
-        <w:t>(</w:t>
-      </w:r>
-      <w:proofErr w:type="gramEnd"/>
-      <w:r>
-        <w:rPr>
-          <w:rFonts w:ascii="Times New Roman" w:hAnsi="Times New Roman"/>
-        </w:rPr>
-        <w:t>a) but not systematically listed in Table 2, resulting in information inconsistency between the figure and table. Please supplement these geometric parameters into Table 2 to align the information across figures and tables, and to ensure experimental reproducibility.</w:t>
+      <w:r>
+        <w:rPr>
+          <w:rFonts w:ascii="Times New Roman" w:hAnsi="Times New Roman"/>
+        </w:rPr>
+        <w:t>(a) but not systematically listed in Table 2, resulting in information inconsistency between the figure and table. Please supplement these geometric parameters into Table 2 to align the information across figures and tables, and to ensure experimental reproducibility.</w:t>
       </w:r>
     </w:p>
     <w:p>
@@ -477,14 +490,7 @@
         <w:rPr>
           <w:rFonts w:ascii="Times New Roman" w:hAnsi="Times New Roman"/>
         </w:rPr>
-        <w:t xml:space="preserve">Lines 240–242: Only one deviatoric stress level (250 kPa) and two confining pressures are </w:t>
-      </w:r>
-      <w:r>
-        <w:rPr>
-          <w:rFonts w:ascii="Times New Roman" w:hAnsi="Times New Roman"/>
-        </w:rPr>
-        <w:lastRenderedPageBreak/>
-        <w:t>used in CSS tests, which is relatively limited. Please explain the basis for selecting this deviatoric stress level</w:t>
+        <w:t>Lines 240–242: Only one deviatoric stress level (250 kPa) and two confining pressures are used in CSS tests, which is relatively limited. Please explain the basis for selecting this deviatoric stress level</w:t>
       </w:r>
       <w:r>
         <w:rPr>
@@ -509,6 +515,7 @@
         <w:rPr>
           <w:rFonts w:ascii="Times New Roman" w:hAnsi="Times New Roman" w:hint="eastAsia"/>
         </w:rPr>
+        <w:lastRenderedPageBreak/>
         <w:t xml:space="preserve">Line 327-328: </w:t>
       </w:r>
       <w:r>
@@ -650,203 +657,6 @@
         <w:t>for different configurations.</w:t>
       </w:r>
       <w:bookmarkEnd w:id="4"/>
-    </w:p>
-    <w:p>
-      <w:pPr>
-        <w:pStyle w:val="a9"/>
-        <w:numPr>
-          <w:ilvl w:val="0"/>
-          <w:numId w:val="1"/>
-        </w:numPr>
-        <w:jc w:val="both"/>
-        <w:rPr>
-          <w:rFonts w:ascii="Times New Roman" w:hAnsi="Times New Roman"/>
-        </w:rPr>
-      </w:pPr>
-      <w:r>
-        <w:rPr>
-          <w:rFonts w:ascii="Times New Roman" w:hAnsi="Times New Roman"/>
-        </w:rPr>
-        <w:t>Lines 488–493: In Equation (2), the physical meaning of</w:t>
-      </w:r>
-      <m:oMath>
-        <m:sSub>
-          <m:sSubPr>
-            <m:ctrlPr>
-              <w:rPr>
-                <w:rFonts w:ascii="Cambria Math" w:hAnsi="Cambria Math"/>
-                <w:i/>
-              </w:rPr>
-            </m:ctrlPr>
-          </m:sSubPr>
-          <m:e>
-            <m:r>
-              <w:rPr>
-                <w:rFonts w:ascii="Cambria Math" w:hAnsi="Cambria Math"/>
-              </w:rPr>
-              <m:t xml:space="preserve"> W</m:t>
-            </m:r>
-          </m:e>
-          <m:sub>
-            <m:r>
-              <w:rPr>
-                <w:rFonts w:ascii="Cambria Math" w:hAnsi="Cambria Math"/>
-              </w:rPr>
-              <m:t>1</m:t>
-            </m:r>
-          </m:sub>
-        </m:sSub>
-      </m:oMath>
-      <w:r>
-        <w:rPr>
-          <w:rFonts w:ascii="Times New Roman" w:hAnsi="Times New Roman"/>
-        </w:rPr>
-        <w:t>under drained constant</w:t>
-      </w:r>
-      <w:bookmarkStart w:id="5" w:name="OLE_LINK8"/>
-      <w:r>
-        <w:rPr>
-          <w:rFonts w:ascii="Times New Roman" w:hAnsi="Times New Roman"/>
-        </w:rPr>
-        <w:t>-</w:t>
-      </w:r>
-      <m:oMath>
-        <m:sSubSup>
-          <m:sSubSupPr>
-            <m:ctrlPr>
-              <w:rPr>
-                <w:rFonts w:ascii="Cambria Math" w:hAnsi="Cambria Math"/>
-                <w:i/>
-              </w:rPr>
-            </m:ctrlPr>
-          </m:sSubSupPr>
-          <m:e>
-            <m:r>
-              <w:rPr>
-                <w:rFonts w:ascii="Cambria Math" w:hAnsi="Cambria Math"/>
-              </w:rPr>
-              <m:t>σ</m:t>
-            </m:r>
-          </m:e>
-          <m:sub>
-            <m:r>
-              <w:rPr>
-                <w:rFonts w:ascii="Cambria Math" w:hAnsi="Cambria Math"/>
-              </w:rPr>
-              <m:t>3</m:t>
-            </m:r>
-          </m:sub>
-          <m:sup>
-            <m:r>
-              <w:rPr>
-                <w:rFonts w:ascii="Cambria Math" w:hAnsi="Cambria Math"/>
-              </w:rPr>
-              <m:t>'</m:t>
-            </m:r>
-          </m:sup>
-        </m:sSubSup>
-      </m:oMath>
-      <w:bookmarkEnd w:id="5"/>
-      <w:r>
-        <w:rPr>
-          <w:rFonts w:ascii="Times New Roman" w:hAnsi="Times New Roman"/>
-        </w:rPr>
-        <w:t xml:space="preserve"> conditions needs clarification. Since</w:t>
-      </w:r>
-      <w:r>
-        <w:rPr>
-          <w:rFonts w:ascii="Times New Roman" w:hAnsi="Times New Roman" w:hint="eastAsia"/>
-        </w:rPr>
-        <w:t xml:space="preserve"> </w:t>
-      </w:r>
-      <m:oMath>
-        <m:sSubSup>
-          <m:sSubSupPr>
-            <m:ctrlPr>
-              <w:rPr>
-                <w:rFonts w:ascii="Cambria Math" w:hAnsi="Cambria Math"/>
-                <w:i/>
-              </w:rPr>
-            </m:ctrlPr>
-          </m:sSubSupPr>
-          <m:e>
-            <m:r>
-              <w:rPr>
-                <w:rFonts w:ascii="Cambria Math" w:hAnsi="Cambria Math"/>
-              </w:rPr>
-              <m:t>σ</m:t>
-            </m:r>
-          </m:e>
-          <m:sub>
-            <m:r>
-              <w:rPr>
-                <w:rFonts w:ascii="Cambria Math" w:hAnsi="Cambria Math"/>
-              </w:rPr>
-              <m:t>3</m:t>
-            </m:r>
-          </m:sub>
-          <m:sup>
-            <m:r>
-              <w:rPr>
-                <w:rFonts w:ascii="Cambria Math" w:hAnsi="Cambria Math"/>
-              </w:rPr>
-              <m:t>'</m:t>
-            </m:r>
-          </m:sup>
-        </m:sSubSup>
-      </m:oMath>
-      <w:r>
-        <w:rPr>
-          <w:rFonts w:ascii="Times New Roman" w:hAnsi="Times New Roman"/>
-        </w:rPr>
-        <w:t xml:space="preserve"> is constant while </w:t>
-      </w:r>
-      <m:oMath>
-        <m:sSup>
-          <m:sSupPr>
-            <m:ctrlPr>
-              <w:rPr>
-                <w:rFonts w:ascii="Cambria Math" w:hAnsi="Cambria Math"/>
-                <w:i/>
-              </w:rPr>
-            </m:ctrlPr>
-          </m:sSupPr>
-          <m:e>
-            <m:r>
-              <w:rPr>
-                <w:rFonts w:ascii="Cambria Math" w:hAnsi="Cambria Math"/>
-              </w:rPr>
-              <m:t>p</m:t>
-            </m:r>
-          </m:e>
-          <m:sup>
-            <m:r>
-              <w:rPr>
-                <w:rFonts w:ascii="Cambria Math" w:hAnsi="Cambria Math"/>
-              </w:rPr>
-              <m:t>'</m:t>
-            </m:r>
-          </m:sup>
-        </m:sSup>
-      </m:oMath>
-      <w:r>
-        <w:rPr>
-          <w:rFonts w:ascii="Times New Roman" w:hAnsi="Times New Roman"/>
-        </w:rPr>
-        <w:t xml:space="preserve"> increases with deviatoric stress, please explain why only the compressive branch is considered in energy</w:t>
-      </w:r>
-      <w:r>
-        <w:rPr>
-          <w:rFonts w:ascii="Times New Roman" w:hAnsi="Times New Roman" w:hint="eastAsia"/>
-        </w:rPr>
-        <w:t xml:space="preserve"> </w:t>
-      </w:r>
-      <w:r>
-        <w:rPr>
-          <w:rFonts w:ascii="Times New Roman" w:hAnsi="Times New Roman"/>
-        </w:rPr>
-        <w:t>calculation.</w:t>
-      </w:r>
     </w:p>
     <w:p>
       <w:pPr>
@@ -938,7 +748,7 @@
         </w:numPr>
         <w:jc w:val="both"/>
         <w:rPr>
-          <w:rFonts w:ascii="Times New Roman" w:hAnsi="Times New Roman" w:hint="eastAsia"/>
+          <w:rFonts w:ascii="Times New Roman" w:hAnsi="Times New Roman"/>
         </w:rPr>
       </w:pPr>
       <w:r>
@@ -978,6 +788,14 @@
         <w:t>, which lacks direct experimental evidence. Please discuss how this hypothesis could be verified (e.g., via local deformation measurement or numerical simulation), and analyze the relationship between the crossover cycle number and confining pressure.</w:t>
       </w:r>
       <w:bookmarkEnd w:id="0"/>
+    </w:p>
+    <w:p>
+      <w:pPr>
+        <w:jc w:val="both"/>
+        <w:rPr>
+          <w:rFonts w:ascii="Times New Roman" w:hAnsi="Times New Roman" w:hint="eastAsia"/>
+        </w:rPr>
+      </w:pPr>
     </w:p>
     <w:sectPr>
       <w:pgSz w:w="11906" w:h="16838"/>

</xml_diff>